<commit_message>
v3.79.53: Portable export: add plain-text README.txt (recipient guide) to viewer packages
</commit_message>
<xml_diff>
--- a/ahgPortableExportPlugin/docs/help.docx
+++ b/ahgPortableExportPlugin/docs/help.docx
@@ -486,7 +486,7 @@
         <w:pStyle w:val="FirstParagraph"/>
       </w:pPr>
       <w:r>
-        <w:t xml:space="preserve">A ZIP archive containing a fully functional web application that runs in any modern browser without a server:</w:t>
+        <w:t xml:space="preserve">A ZIP archive (or unzipped folder) containing a fully functional web application that runs in any modern browser without a server:</w:t>
       </w:r>
     </w:p>
     <w:p>
@@ -501,13 +501,13 @@
         <w:rPr>
           <w:rStyle w:val="VerbatimChar"/>
         </w:rPr>
-        <w:t xml:space="preserve">index.html</w:t>
-      </w:r>
-      <w:r>
-        <w:t xml:space="preserve"> </w:t>
-      </w:r>
-      <w:r>
-        <w:t xml:space="preserve">— Main viewer entry point</w:t>
+        <w:t xml:space="preserve">README.txt</w:t>
+      </w:r>
+      <w:r>
+        <w:t xml:space="preserve"> </w:t>
+      </w:r>
+      <w:r>
+        <w:t xml:space="preserve">— Plain-language guide for the recipient: what the package is, how to open it, what’s inside, and an access/confidentiality note</w:t>
       </w:r>
     </w:p>
     <w:p>
@@ -522,13 +522,13 @@
         <w:rPr>
           <w:rStyle w:val="VerbatimChar"/>
         </w:rPr>
-        <w:t xml:space="preserve">data/catalogue.json</w:t>
-      </w:r>
-      <w:r>
-        <w:t xml:space="preserve"> </w:t>
-      </w:r>
-      <w:r>
-        <w:t xml:space="preserve">— Description records with access points, dates, creators</w:t>
+        <w:t xml:space="preserve">index.html</w:t>
+      </w:r>
+      <w:r>
+        <w:t xml:space="preserve"> </w:t>
+      </w:r>
+      <w:r>
+        <w:t xml:space="preserve">— Main viewer entry point</w:t>
       </w:r>
     </w:p>
     <w:p>
@@ -543,6 +543,27 @@
         <w:rPr>
           <w:rStyle w:val="VerbatimChar"/>
         </w:rPr>
+        <w:t xml:space="preserve">data/catalogue.json</w:t>
+      </w:r>
+      <w:r>
+        <w:t xml:space="preserve"> </w:t>
+      </w:r>
+      <w:r>
+        <w:t xml:space="preserve">— Description records with access points, dates, creators</w:t>
+      </w:r>
+    </w:p>
+    <w:p>
+      <w:pPr>
+        <w:numPr>
+          <w:ilvl w:val="0"/>
+          <w:numId w:val="1003"/>
+        </w:numPr>
+        <w:pStyle w:val="Compact"/>
+      </w:pPr>
+      <w:r>
+        <w:rPr>
+          <w:rStyle w:val="VerbatimChar"/>
+        </w:rPr>
         <w:t xml:space="preserve">data/search-index.json</w:t>
       </w:r>
       <w:r>
@@ -550,6 +571,27 @@
       </w:r>
       <w:r>
         <w:t xml:space="preserve">— Pre-built search index (FlexSearch)</w:t>
+      </w:r>
+    </w:p>
+    <w:p>
+      <w:pPr>
+        <w:numPr>
+          <w:ilvl w:val="0"/>
+          <w:numId w:val="1003"/>
+        </w:numPr>
+        <w:pStyle w:val="Compact"/>
+      </w:pPr>
+      <w:r>
+        <w:rPr>
+          <w:rStyle w:val="VerbatimChar"/>
+        </w:rPr>
+        <w:t xml:space="preserve">data/disclosure-summary.json</w:t>
+      </w:r>
+      <w:r>
+        <w:t xml:space="preserve"> </w:t>
+      </w:r>
+      <w:r>
+        <w:t xml:space="preserve">— What was withheld and why</w:t>
       </w:r>
     </w:p>
     <w:p>

</xml_diff>